<commit_message>
modificacion en nombre de archivos
</commit_message>
<xml_diff>
--- a/Documentation/Historias de usuario.docx
+++ b/Documentation/Historias de usuario.docx
@@ -21,17 +21,9 @@
     </w:p>
     <w:p>
       <w:pPr>
-        <w:rPr>
-          <w:lang w:val="es-ES"/>
-        </w:rPr>
-      </w:pPr>
-    </w:p>
-    <w:p>
-      <w:pPr>
-        <w:pStyle w:val="Prrafodelista"/>
         <w:numPr>
           <w:ilvl w:val="0"/>
-          <w:numId w:val="2"/>
+          <w:numId w:val="3"/>
         </w:numPr>
         <w:rPr>
           <w:b/>
@@ -45,76 +37,191 @@
           <w:bCs/>
           <w:lang w:val="es-ES"/>
         </w:rPr>
-        <w:t>Historia: Solicitar pedido</w:t>
-      </w:r>
-    </w:p>
-    <w:p>
-      <w:pPr>
-        <w:ind w:left="360"/>
-        <w:rPr>
-          <w:lang w:val="es-ES"/>
-        </w:rPr>
-      </w:pPr>
-      <w:r>
-        <w:rPr>
-          <w:lang w:val="es-ES"/>
-        </w:rPr>
-        <w:t xml:space="preserve">Como cliente </w:t>
-      </w:r>
-      <w:r>
-        <w:rPr>
-          <w:lang w:val="es-ES"/>
-        </w:rPr>
-        <w:t>del restaurante</w:t>
-      </w:r>
-    </w:p>
-    <w:p>
-      <w:pPr>
-        <w:ind w:left="360"/>
-        <w:rPr>
-          <w:lang w:val="es-ES"/>
-        </w:rPr>
-      </w:pPr>
-      <w:r>
-        <w:rPr>
-          <w:lang w:val="es-ES"/>
-        </w:rPr>
-        <w:t>Quiero hacer un pedido</w:t>
-      </w:r>
-    </w:p>
-    <w:p>
-      <w:pPr>
-        <w:ind w:left="360"/>
-        <w:rPr>
-          <w:lang w:val="es-ES"/>
-        </w:rPr>
-      </w:pPr>
-      <w:r>
-        <w:rPr>
-          <w:lang w:val="es-ES"/>
-        </w:rPr>
-        <w:t xml:space="preserve">Para </w:t>
-      </w:r>
-    </w:p>
-    <w:p>
-      <w:pPr>
-        <w:rPr>
-          <w:lang w:val="es-ES"/>
-        </w:rPr>
-      </w:pPr>
-      <w:r>
-        <w:rPr>
-          <w:lang w:val="es-ES"/>
-        </w:rPr>
-        <w:tab/>
-      </w:r>
-    </w:p>
-    <w:p>
-      <w:pPr>
-        <w:pStyle w:val="Prrafodelista"/>
+        <w:t>Historia: Cliente</w:t>
+      </w:r>
+    </w:p>
+    <w:p>
+      <w:pPr>
+        <w:numPr>
+          <w:ilvl w:val="1"/>
+          <w:numId w:val="3"/>
+        </w:numPr>
+        <w:rPr>
+          <w:b/>
+          <w:bCs/>
+          <w:lang w:val="es-ES"/>
+        </w:rPr>
+      </w:pPr>
+      <w:r>
+        <w:rPr>
+          <w:b/>
+          <w:bCs/>
+          <w:lang w:val="es-ES"/>
+        </w:rPr>
+        <w:t>Como cliente del restaurante, quiero hacer un pedido.</w:t>
+      </w:r>
+    </w:p>
+    <w:p>
+      <w:pPr>
+        <w:numPr>
+          <w:ilvl w:val="1"/>
+          <w:numId w:val="3"/>
+        </w:numPr>
+        <w:rPr>
+          <w:b/>
+          <w:bCs/>
+          <w:lang w:val="es-ES"/>
+        </w:rPr>
+      </w:pPr>
+      <w:r>
+        <w:rPr>
+          <w:b/>
+          <w:bCs/>
+          <w:lang w:val="es-ES"/>
+        </w:rPr>
+        <w:t>Como cliente del restaurante, quiero confirmar mi pedido.</w:t>
+      </w:r>
+    </w:p>
+    <w:p>
+      <w:pPr>
+        <w:numPr>
+          <w:ilvl w:val="1"/>
+          <w:numId w:val="3"/>
+        </w:numPr>
+        <w:rPr>
+          <w:b/>
+          <w:bCs/>
+          <w:lang w:val="es-ES"/>
+        </w:rPr>
+      </w:pPr>
+      <w:r>
+        <w:rPr>
+          <w:b/>
+          <w:bCs/>
+          <w:lang w:val="es-ES"/>
+        </w:rPr>
+        <w:t>Como cliente del restaurante, quiero cancelar mi pedido.</w:t>
+      </w:r>
+    </w:p>
+    <w:p>
+      <w:pPr>
+        <w:numPr>
+          <w:ilvl w:val="1"/>
+          <w:numId w:val="3"/>
+        </w:numPr>
+        <w:rPr>
+          <w:b/>
+          <w:bCs/>
+          <w:lang w:val="es-ES"/>
+        </w:rPr>
+      </w:pPr>
+      <w:r>
+        <w:rPr>
+          <w:b/>
+          <w:bCs/>
+          <w:lang w:val="es-ES"/>
+        </w:rPr>
+        <w:t>Como cliente del restaurante, quiero agregar o quitar productos de mi pedido.</w:t>
+      </w:r>
+    </w:p>
+    <w:p>
+      <w:pPr>
+        <w:numPr>
+          <w:ilvl w:val="1"/>
+          <w:numId w:val="3"/>
+        </w:numPr>
+        <w:rPr>
+          <w:b/>
+          <w:bCs/>
+          <w:lang w:val="es-ES"/>
+        </w:rPr>
+      </w:pPr>
+      <w:r>
+        <w:rPr>
+          <w:b/>
+          <w:bCs/>
+          <w:lang w:val="es-ES"/>
+        </w:rPr>
+        <w:t>Como cliente del restaurante, quiero pagar mi pedido, para poder llevármelo a casa.</w:t>
+      </w:r>
+    </w:p>
+    <w:p>
+      <w:pPr>
+        <w:numPr>
+          <w:ilvl w:val="1"/>
+          <w:numId w:val="3"/>
+        </w:numPr>
+        <w:rPr>
+          <w:b/>
+          <w:bCs/>
+          <w:lang w:val="es-ES"/>
+        </w:rPr>
+      </w:pPr>
+      <w:r>
+        <w:rPr>
+          <w:b/>
+          <w:bCs/>
+          <w:lang w:val="es-ES"/>
+        </w:rPr>
+        <w:t>Como cliente del restaurante, quiero pagar con distintos modos de pago.</w:t>
+      </w:r>
+    </w:p>
+    <w:p>
+      <w:pPr>
+        <w:numPr>
+          <w:ilvl w:val="1"/>
+          <w:numId w:val="3"/>
+        </w:numPr>
+        <w:rPr>
+          <w:b/>
+          <w:bCs/>
+          <w:lang w:val="es-ES"/>
+        </w:rPr>
+      </w:pPr>
+      <w:r>
+        <w:rPr>
+          <w:b/>
+          <w:bCs/>
+          <w:lang w:val="es-ES"/>
+        </w:rPr>
+        <w:t>Como cliente del restaurante, quiero recibir una factura, para tener en cuenta el gasto realizado en el restaurante.</w:t>
+      </w:r>
+    </w:p>
+    <w:p>
+      <w:pPr>
+        <w:numPr>
+          <w:ilvl w:val="1"/>
+          <w:numId w:val="3"/>
+        </w:numPr>
+        <w:rPr>
+          <w:b/>
+          <w:bCs/>
+          <w:lang w:val="es-ES"/>
+        </w:rPr>
+      </w:pPr>
+      <w:r>
+        <w:rPr>
+          <w:b/>
+          <w:bCs/>
+          <w:lang w:val="es-ES"/>
+        </w:rPr>
+        <w:t>Como cliente del restaurante, quiero poder navegar por el menú interactivo, para poder seleccionar productos y realizar mi pedido fácilmente.</w:t>
+      </w:r>
+    </w:p>
+    <w:p>
+      <w:pPr>
+        <w:rPr>
+          <w:b/>
+          <w:bCs/>
+          <w:lang w:val="es-ES"/>
+        </w:rPr>
+      </w:pPr>
+    </w:p>
+    <w:p>
+      <w:pPr>
         <w:numPr>
           <w:ilvl w:val="0"/>
-          <w:numId w:val="2"/>
+          <w:numId w:val="3"/>
         </w:numPr>
         <w:rPr>
           <w:b/>
@@ -128,38 +235,277 @@
           <w:bCs/>
           <w:lang w:val="es-ES"/>
         </w:rPr>
-        <w:t>Historia:</w:t>
-      </w:r>
-      <w:r>
-        <w:rPr>
-          <w:b/>
-          <w:bCs/>
-          <w:lang w:val="es-ES"/>
-        </w:rPr>
-        <w:t xml:space="preserve"> Agregar producto al pedido</w:t>
-      </w:r>
-    </w:p>
-    <w:p>
-      <w:pPr>
-        <w:pStyle w:val="Prrafodelista"/>
-        <w:rPr>
-          <w:lang w:val="es-ES"/>
-        </w:rPr>
-      </w:pPr>
-      <w:r>
-        <w:rPr>
-          <w:lang w:val="es-ES"/>
-        </w:rPr>
-        <w:t>Como cliente del restaurante</w:t>
-      </w:r>
-    </w:p>
-    <w:p>
-      <w:pPr>
-        <w:pStyle w:val="Prrafodelista"/>
-        <w:rPr>
-          <w:lang w:val="es-ES"/>
-        </w:rPr>
-      </w:pPr>
+        <w:t xml:space="preserve">Historia: Administrador-Inventario </w:t>
+      </w:r>
+    </w:p>
+    <w:p>
+      <w:pPr>
+        <w:numPr>
+          <w:ilvl w:val="1"/>
+          <w:numId w:val="3"/>
+        </w:numPr>
+        <w:rPr>
+          <w:b/>
+          <w:bCs/>
+          <w:lang w:val="es-ES"/>
+        </w:rPr>
+      </w:pPr>
+      <w:r>
+        <w:rPr>
+          <w:b/>
+          <w:bCs/>
+          <w:lang w:val="es-ES"/>
+        </w:rPr>
+        <w:t>Como administrador del restaurante, quiero añadir productos al inventario, para que puedan ser comercializados.</w:t>
+      </w:r>
+    </w:p>
+    <w:p>
+      <w:pPr>
+        <w:numPr>
+          <w:ilvl w:val="1"/>
+          <w:numId w:val="3"/>
+        </w:numPr>
+        <w:rPr>
+          <w:b/>
+          <w:bCs/>
+          <w:lang w:val="es-ES"/>
+        </w:rPr>
+      </w:pPr>
+      <w:r>
+        <w:rPr>
+          <w:b/>
+          <w:bCs/>
+          <w:lang w:val="es-ES"/>
+        </w:rPr>
+        <w:t xml:space="preserve"> Como administrador del restaurante, quiero editar los productos que sean ingresados al inventario, para darle su uso en el negocio.</w:t>
+      </w:r>
+    </w:p>
+    <w:p>
+      <w:pPr>
+        <w:numPr>
+          <w:ilvl w:val="1"/>
+          <w:numId w:val="3"/>
+        </w:numPr>
+        <w:rPr>
+          <w:b/>
+          <w:bCs/>
+          <w:lang w:val="es-ES"/>
+        </w:rPr>
+      </w:pPr>
+      <w:r>
+        <w:rPr>
+          <w:b/>
+          <w:bCs/>
+          <w:lang w:val="es-ES"/>
+        </w:rPr>
+        <w:t>Como administrador del restaurante, quiero eliminar productos del inventario.</w:t>
+      </w:r>
+    </w:p>
+    <w:p>
+      <w:pPr>
+        <w:rPr>
+          <w:b/>
+          <w:bCs/>
+          <w:lang w:val="es-ES"/>
+        </w:rPr>
+      </w:pPr>
+    </w:p>
+    <w:p>
+      <w:pPr>
+        <w:numPr>
+          <w:ilvl w:val="0"/>
+          <w:numId w:val="3"/>
+        </w:numPr>
+        <w:rPr>
+          <w:b/>
+          <w:bCs/>
+          <w:lang w:val="es-ES"/>
+        </w:rPr>
+      </w:pPr>
+      <w:r>
+        <w:rPr>
+          <w:b/>
+          <w:bCs/>
+          <w:lang w:val="es-ES"/>
+        </w:rPr>
+        <w:t xml:space="preserve">Historia: Administrador-Catalogo </w:t>
+      </w:r>
+    </w:p>
+    <w:p>
+      <w:pPr>
+        <w:numPr>
+          <w:ilvl w:val="1"/>
+          <w:numId w:val="3"/>
+        </w:numPr>
+        <w:rPr>
+          <w:b/>
+          <w:bCs/>
+          <w:lang w:val="es-ES"/>
+        </w:rPr>
+      </w:pPr>
+      <w:r>
+        <w:rPr>
+          <w:b/>
+          <w:bCs/>
+          <w:lang w:val="es-ES"/>
+        </w:rPr>
+        <w:t>Como administrador del restaurante, quiero añadir productos al catálogo, para que puedan ser observados de cara al público.</w:t>
+      </w:r>
+    </w:p>
+    <w:p>
+      <w:pPr>
+        <w:numPr>
+          <w:ilvl w:val="1"/>
+          <w:numId w:val="3"/>
+        </w:numPr>
+        <w:rPr>
+          <w:b/>
+          <w:bCs/>
+          <w:lang w:val="es-ES"/>
+        </w:rPr>
+      </w:pPr>
+      <w:r>
+        <w:rPr>
+          <w:b/>
+          <w:bCs/>
+          <w:lang w:val="es-ES"/>
+        </w:rPr>
+        <w:lastRenderedPageBreak/>
+        <w:t xml:space="preserve"> Como administrador del restaurante, quiero editar los productos que sean ingresados al catálogo.</w:t>
+      </w:r>
+    </w:p>
+    <w:p>
+      <w:pPr>
+        <w:numPr>
+          <w:ilvl w:val="1"/>
+          <w:numId w:val="3"/>
+        </w:numPr>
+        <w:rPr>
+          <w:b/>
+          <w:bCs/>
+          <w:lang w:val="es-ES"/>
+        </w:rPr>
+      </w:pPr>
+      <w:r>
+        <w:rPr>
+          <w:b/>
+          <w:bCs/>
+          <w:lang w:val="es-ES"/>
+        </w:rPr>
+        <w:t>Como administrador del restaurante, quiero eliminar productos del catálogo.</w:t>
+      </w:r>
+    </w:p>
+    <w:p>
+      <w:pPr>
+        <w:rPr>
+          <w:b/>
+          <w:bCs/>
+          <w:lang w:val="es-ES"/>
+        </w:rPr>
+      </w:pPr>
+    </w:p>
+    <w:p>
+      <w:pPr>
+        <w:numPr>
+          <w:ilvl w:val="0"/>
+          <w:numId w:val="3"/>
+        </w:numPr>
+        <w:rPr>
+          <w:b/>
+          <w:bCs/>
+          <w:lang w:val="es-ES"/>
+        </w:rPr>
+      </w:pPr>
+      <w:r>
+        <w:rPr>
+          <w:b/>
+          <w:bCs/>
+          <w:lang w:val="es-ES"/>
+        </w:rPr>
+        <w:t xml:space="preserve">Historia: Administrador- </w:t>
+      </w:r>
+      <w:proofErr w:type="spellStart"/>
+      <w:r>
+        <w:rPr>
+          <w:b/>
+          <w:bCs/>
+          <w:lang w:val="es-ES"/>
+        </w:rPr>
+        <w:t>Loggers</w:t>
+      </w:r>
+      <w:proofErr w:type="spellEnd"/>
+      <w:r>
+        <w:rPr>
+          <w:b/>
+          <w:bCs/>
+          <w:lang w:val="es-ES"/>
+        </w:rPr>
+        <w:tab/>
+        <w:t xml:space="preserve"> </w:t>
+      </w:r>
+    </w:p>
+    <w:p>
+      <w:pPr>
+        <w:numPr>
+          <w:ilvl w:val="1"/>
+          <w:numId w:val="3"/>
+        </w:numPr>
+        <w:rPr>
+          <w:b/>
+          <w:bCs/>
+          <w:lang w:val="es-ES"/>
+        </w:rPr>
+      </w:pPr>
+      <w:r>
+        <w:rPr>
+          <w:b/>
+          <w:bCs/>
+          <w:lang w:val="es-ES"/>
+        </w:rPr>
+        <w:t>Como administrador del restaurante, quiero que se generen registros de todas las acciones del sistema, para poder revisar actividades y detectar problemas o errores.</w:t>
+      </w:r>
+    </w:p>
+    <w:p>
+      <w:pPr>
+        <w:numPr>
+          <w:ilvl w:val="1"/>
+          <w:numId w:val="3"/>
+        </w:numPr>
+        <w:rPr>
+          <w:b/>
+          <w:bCs/>
+          <w:lang w:val="es-ES"/>
+        </w:rPr>
+      </w:pPr>
+      <w:r>
+        <w:rPr>
+          <w:b/>
+          <w:bCs/>
+          <w:lang w:val="es-ES"/>
+        </w:rPr>
+        <w:t>Como administrador, quiero poder consultar los registros de acciones del sistema, para auditar quién hizo qué y cuándo.</w:t>
+      </w:r>
+    </w:p>
+    <w:p>
+      <w:pPr>
+        <w:numPr>
+          <w:ilvl w:val="1"/>
+          <w:numId w:val="3"/>
+        </w:numPr>
+        <w:rPr>
+          <w:b/>
+          <w:bCs/>
+          <w:lang w:val="es-ES"/>
+        </w:rPr>
+      </w:pPr>
+      <w:r>
+        <w:rPr>
+          <w:b/>
+          <w:bCs/>
+          <w:lang w:val="es-ES"/>
+        </w:rPr>
+        <w:t>Como administrador del restaurante, quiero un menú interactivo para gestionar los productos del catálogo y del inventario, para poder agregar, editar o eliminar productos fácilmente.</w:t>
+      </w:r>
     </w:p>
     <w:p>
       <w:pPr>
@@ -199,7 +545,7 @@
         <w:b w:val="0"/>
       </w:rPr>
     </w:lvl>
-    <w:lvl w:ilvl="1" w:tplc="240A0019" w:tentative="1">
+    <w:lvl w:ilvl="1" w:tplc="240A0019">
       <w:start w:val="1"/>
       <w:numFmt w:val="lowerLetter"/>
       <w:lvlText w:val="%2."/>
@@ -389,6 +735,36 @@
   </w:num>
   <w:num w:numId="2" w16cid:durableId="1147235937">
     <w:abstractNumId w:val="0"/>
+  </w:num>
+  <w:num w:numId="3" w16cid:durableId="1406147056">
+    <w:abstractNumId w:val="0"/>
+    <w:lvlOverride w:ilvl="0">
+      <w:startOverride w:val="1"/>
+    </w:lvlOverride>
+    <w:lvlOverride w:ilvl="1">
+      <w:startOverride w:val="1"/>
+    </w:lvlOverride>
+    <w:lvlOverride w:ilvl="2">
+      <w:startOverride w:val="1"/>
+    </w:lvlOverride>
+    <w:lvlOverride w:ilvl="3">
+      <w:startOverride w:val="1"/>
+    </w:lvlOverride>
+    <w:lvlOverride w:ilvl="4">
+      <w:startOverride w:val="1"/>
+    </w:lvlOverride>
+    <w:lvlOverride w:ilvl="5">
+      <w:startOverride w:val="1"/>
+    </w:lvlOverride>
+    <w:lvlOverride w:ilvl="6">
+      <w:startOverride w:val="1"/>
+    </w:lvlOverride>
+    <w:lvlOverride w:ilvl="7">
+      <w:startOverride w:val="1"/>
+    </w:lvlOverride>
+    <w:lvlOverride w:ilvl="8">
+      <w:startOverride w:val="1"/>
+    </w:lvlOverride>
   </w:num>
 </w:numbering>
 </file>
@@ -996,7 +1372,6 @@
   <w:style w:type="character" w:default="1" w:styleId="Fuentedeprrafopredeter">
     <w:name w:val="Default Paragraph Font"/>
     <w:uiPriority w:val="1"/>
-    <w:semiHidden/>
     <w:unhideWhenUsed/>
   </w:style>
   <w:style w:type="table" w:default="1" w:styleId="Tablanormal">

</xml_diff>